<commit_message>
All course work done
final upload of all course work for cyberops
</commit_message>
<xml_diff>
--- a/CyberOps115/Module02/3.3.11 Lab - Using Windows PowerShell - Jadon Kosberg.docx
+++ b/CyberOps115/Module02/3.3.11 Lab - Using Windows PowerShell - Jadon Kosberg.docx
@@ -175,12 +175,14 @@
       <w:r>
         <w:t xml:space="preserve">. Search and select </w:t>
       </w:r>
+      <w:proofErr w:type="spellStart"/>
       <w:r>
         <w:rPr>
           <w:b/>
         </w:rPr>
         <w:t>powershell</w:t>
       </w:r>
+      <w:proofErr w:type="spellEnd"/>
       <w:r>
         <w:t>.</w:t>
       </w:r>
@@ -227,12 +229,14 @@
       <w:r>
         <w:t xml:space="preserve">Enter </w:t>
       </w:r>
+      <w:proofErr w:type="spellStart"/>
       <w:r>
         <w:rPr>
           <w:b/>
         </w:rPr>
         <w:t>dir</w:t>
       </w:r>
+      <w:proofErr w:type="spellEnd"/>
       <w:r>
         <w:t xml:space="preserve"> at the prompt in both windows.</w:t>
       </w:r>
@@ -253,6 +257,7 @@
       <w:r>
         <w:t xml:space="preserve">What are the outputs to the </w:t>
       </w:r>
+      <w:proofErr w:type="spellStart"/>
       <w:r>
         <w:rPr>
           <w:b/>
@@ -265,6 +270,7 @@
         </w:rPr>
         <w:t>ir</w:t>
       </w:r>
+      <w:proofErr w:type="spellEnd"/>
       <w:r>
         <w:t xml:space="preserve"> command?</w:t>
       </w:r>
@@ -369,8 +375,16 @@
         <w:rPr>
           <w:b/>
         </w:rPr>
-        <w:t>Get-Alias dir</w:t>
-      </w:r>
+        <w:t xml:space="preserve">Get-Alias </w:t>
+      </w:r>
+      <w:proofErr w:type="spellStart"/>
+      <w:r>
+        <w:rPr>
+          <w:b/>
+        </w:rPr>
+        <w:t>dir</w:t>
+      </w:r>
+      <w:proofErr w:type="spellEnd"/>
       <w:r>
         <w:t xml:space="preserve"> at the PowerShell prompt.</w:t>
       </w:r>
@@ -386,21 +400,31 @@
         <w:rPr>
           <w:b/>
         </w:rPr>
-        <w:t>Get-Alias dir</w:t>
-      </w:r>
-    </w:p>
-    <w:p>
-      <w:pPr>
-        <w:pStyle w:val="CMDOutput"/>
-      </w:pPr>
-    </w:p>
-    <w:p>
-      <w:pPr>
-        <w:pStyle w:val="CMDOutput"/>
-      </w:pPr>
+        <w:t xml:space="preserve">Get-Alias </w:t>
+      </w:r>
+      <w:proofErr w:type="spellStart"/>
+      <w:r>
+        <w:rPr>
+          <w:b/>
+        </w:rPr>
+        <w:t>dir</w:t>
+      </w:r>
+      <w:proofErr w:type="spellEnd"/>
+    </w:p>
+    <w:p>
+      <w:pPr>
+        <w:pStyle w:val="CMDOutput"/>
+      </w:pPr>
+    </w:p>
+    <w:p>
+      <w:pPr>
+        <w:pStyle w:val="CMDOutput"/>
+      </w:pPr>
+      <w:proofErr w:type="spellStart"/>
       <w:r>
         <w:t>CommandTypeNameVersionSource</w:t>
       </w:r>
+      <w:proofErr w:type="spellEnd"/>
     </w:p>
     <w:p>
       <w:pPr>
@@ -415,9 +439,19 @@
       <w:pPr>
         <w:pStyle w:val="CMDOutput"/>
       </w:pPr>
-      <w:r>
-        <w:t>Aliasdir -&gt; Get-ChildItem</w:t>
-      </w:r>
+      <w:proofErr w:type="spellStart"/>
+      <w:r>
+        <w:t>Aliasdir</w:t>
+      </w:r>
+      <w:proofErr w:type="spellEnd"/>
+      <w:r>
+        <w:t xml:space="preserve"> -&gt; Get-</w:t>
+      </w:r>
+      <w:proofErr w:type="spellStart"/>
+      <w:r>
+        <w:t>ChildItem</w:t>
+      </w:r>
+      <w:proofErr w:type="spellEnd"/>
     </w:p>
     <w:p>
       <w:pPr>
@@ -435,12 +469,14 @@
       <w:r>
         <w:t xml:space="preserve">What is the PowerShell command for </w:t>
       </w:r>
+      <w:proofErr w:type="spellStart"/>
       <w:r>
         <w:rPr>
           <w:b/>
         </w:rPr>
         <w:t>dir</w:t>
       </w:r>
+      <w:proofErr w:type="spellEnd"/>
       <w:r>
         <w:t>?</w:t>
       </w:r>
@@ -468,7 +504,23 @@
           <w:b/>
           <w:bCs/>
         </w:rPr>
-        <w:t>Microsoft powershell cmdlets</w:t>
+        <w:t xml:space="preserve">Microsoft </w:t>
+      </w:r>
+      <w:proofErr w:type="spellStart"/>
+      <w:r>
+        <w:rPr>
+          <w:b/>
+          <w:bCs/>
+        </w:rPr>
+        <w:t>powershell</w:t>
+      </w:r>
+      <w:proofErr w:type="spellEnd"/>
+      <w:r>
+        <w:rPr>
+          <w:b/>
+          <w:bCs/>
+        </w:rPr>
+        <w:t xml:space="preserve"> cmdlets</w:t>
       </w:r>
       <w:r>
         <w:t>.</w:t>
@@ -1117,7 +1169,21 @@
         <w:rPr>
           <w:b/>
         </w:rPr>
-        <w:t xml:space="preserve">netstat -abno </w:t>
+        <w:t>netstat -</w:t>
+      </w:r>
+      <w:proofErr w:type="spellStart"/>
+      <w:r>
+        <w:rPr>
+          <w:b/>
+        </w:rPr>
+        <w:t>abno</w:t>
+      </w:r>
+      <w:proofErr w:type="spellEnd"/>
+      <w:r>
+        <w:rPr>
+          <w:b/>
+        </w:rPr>
+        <w:t xml:space="preserve"> </w:t>
       </w:r>
       <w:r>
         <w:t>at the prompt.</w:t>
@@ -1134,8 +1200,16 @@
         <w:rPr>
           <w:b/>
         </w:rPr>
-        <w:t>netstat -abno</w:t>
-      </w:r>
+        <w:t>netstat -</w:t>
+      </w:r>
+      <w:proofErr w:type="spellStart"/>
+      <w:r>
+        <w:rPr>
+          <w:b/>
+        </w:rPr>
+        <w:t>abno</w:t>
+      </w:r>
+      <w:proofErr w:type="spellEnd"/>
     </w:p>
     <w:p>
       <w:pPr>
@@ -1190,12 +1264,14 @@
       <w:r>
         <w:t xml:space="preserve">  </w:t>
       </w:r>
+      <w:proofErr w:type="spellStart"/>
       <w:r>
         <w:rPr>
           <w:highlight w:val="yellow"/>
         </w:rPr>
         <w:t>RpcSs</w:t>
       </w:r>
+      <w:proofErr w:type="spellEnd"/>
     </w:p>
     <w:p>
       <w:pPr>
@@ -1280,8 +1356,13 @@
         <w:pStyle w:val="CMDOutput"/>
       </w:pPr>
       <w:r>
-        <w:t xml:space="preserve">  EventLog</w:t>
-      </w:r>
+        <w:t xml:space="preserve">  </w:t>
+      </w:r>
+      <w:proofErr w:type="spellStart"/>
+      <w:r>
+        <w:t>EventLog</w:t>
+      </w:r>
+      <w:proofErr w:type="spellEnd"/>
     </w:p>
     <w:p>
       <w:pPr>
@@ -1354,7 +1435,15 @@
         <w:pStyle w:val="SubStepAlpha"/>
       </w:pPr>
       <w:r>
-        <w:t>Select one of the PIDs from the results of netstat -abno. PID 756 is used in this example.</w:t>
+        <w:t>Select one of the PIDs from the results of netstat -</w:t>
+      </w:r>
+      <w:proofErr w:type="spellStart"/>
+      <w:r>
+        <w:t>abno</w:t>
+      </w:r>
+      <w:proofErr w:type="spellEnd"/>
+      <w:r>
+        <w:t>. PID 756 is used in this example.</w:t>
       </w:r>
     </w:p>
     <w:p>
@@ -1491,8 +1580,16 @@
         <w:rPr>
           <w:b/>
         </w:rPr>
-        <w:t>clear-recyclebin</w:t>
-      </w:r>
+        <w:t>clear-</w:t>
+      </w:r>
+      <w:proofErr w:type="spellStart"/>
+      <w:r>
+        <w:rPr>
+          <w:b/>
+        </w:rPr>
+        <w:t>recyclebin</w:t>
+      </w:r>
+      <w:proofErr w:type="spellEnd"/>
       <w:r>
         <w:t xml:space="preserve"> at the prompt.</w:t>
       </w:r>
@@ -1508,8 +1605,16 @@
         <w:rPr>
           <w:b/>
         </w:rPr>
-        <w:t>clear-recyclebin</w:t>
-      </w:r>
+        <w:t>clear-</w:t>
+      </w:r>
+      <w:proofErr w:type="spellStart"/>
+      <w:r>
+        <w:rPr>
+          <w:b/>
+        </w:rPr>
+        <w:t>recyclebin</w:t>
+      </w:r>
+      <w:proofErr w:type="spellEnd"/>
     </w:p>
     <w:p>
       <w:pPr>
@@ -1537,7 +1642,15 @@
         <w:pStyle w:val="CMDOutput"/>
       </w:pPr>
       <w:r>
-        <w:t>Performing the operation "Clear-RecycleBin" on target "All of the contents of the Recycle Bin".</w:t>
+        <w:t>Performing the operation "Clear-</w:t>
+      </w:r>
+      <w:proofErr w:type="spellStart"/>
+      <w:r>
+        <w:t>RecycleBin</w:t>
+      </w:r>
+      <w:proofErr w:type="spellEnd"/>
+      <w:r>
+        <w:t>" on target "All of the contents of the Recycle Bin".</w:t>
       </w:r>
     </w:p>
     <w:p>
@@ -1752,7 +1865,77 @@
           <w:sz w:val="28"/>
           <w:szCs w:val="28"/>
         </w:rPr>
-        <w:t>a. dir</w:t>
+        <w:t xml:space="preserve">a. </w:t>
+      </w:r>
+      <w:r>
+        <w:rPr>
+          <w:color w:val="EE0000"/>
+          <w:sz w:val="28"/>
+          <w:szCs w:val="28"/>
+        </w:rPr>
+        <w:t xml:space="preserve">Putting in the </w:t>
+      </w:r>
+      <w:proofErr w:type="spellStart"/>
+      <w:r>
+        <w:rPr>
+          <w:color w:val="EE0000"/>
+          <w:sz w:val="28"/>
+          <w:szCs w:val="28"/>
+        </w:rPr>
+        <w:t>dir</w:t>
+      </w:r>
+      <w:proofErr w:type="spellEnd"/>
+      <w:r>
+        <w:rPr>
+          <w:color w:val="EE0000"/>
+          <w:sz w:val="28"/>
+          <w:szCs w:val="28"/>
+        </w:rPr>
+        <w:t xml:space="preserve"> command in both </w:t>
+      </w:r>
+      <w:proofErr w:type="spellStart"/>
+      <w:r>
+        <w:rPr>
+          <w:color w:val="EE0000"/>
+          <w:sz w:val="28"/>
+          <w:szCs w:val="28"/>
+        </w:rPr>
+        <w:t>powershell</w:t>
+      </w:r>
+      <w:proofErr w:type="spellEnd"/>
+      <w:r>
+        <w:rPr>
+          <w:color w:val="EE0000"/>
+          <w:sz w:val="28"/>
+          <w:szCs w:val="28"/>
+        </w:rPr>
+        <w:t xml:space="preserve"> and </w:t>
+      </w:r>
+      <w:proofErr w:type="spellStart"/>
+      <w:r>
+        <w:rPr>
+          <w:color w:val="EE0000"/>
+          <w:sz w:val="28"/>
+          <w:szCs w:val="28"/>
+        </w:rPr>
+        <w:t>cmd</w:t>
+      </w:r>
+      <w:proofErr w:type="spellEnd"/>
+      <w:r>
+        <w:rPr>
+          <w:color w:val="EE0000"/>
+          <w:sz w:val="28"/>
+          <w:szCs w:val="28"/>
+        </w:rPr>
+        <w:t xml:space="preserve"> shows a list of directories and files and associated data</w:t>
+      </w:r>
+      <w:r>
+        <w:rPr>
+          <w:color w:val="EE0000"/>
+          <w:sz w:val="28"/>
+          <w:szCs w:val="28"/>
+        </w:rPr>
+        <w:t xml:space="preserve"> that is associated with them. It shows file size, the type of data, and the date and time it was last edited. In the PowerShell window it also shows modes.</w:t>
       </w:r>
     </w:p>
     <w:p>
@@ -1770,7 +1953,41 @@
           <w:sz w:val="28"/>
           <w:szCs w:val="28"/>
         </w:rPr>
-        <w:t xml:space="preserve">b. mk </w:t>
+        <w:drawing>
+          <wp:inline distT="0" distB="0" distL="0" distR="0" wp14:anchorId="23304E42" wp14:editId="12A0D775">
+            <wp:extent cx="6141720" cy="3460201"/>
+            <wp:effectExtent l="0" t="0" r="0" b="6985"/>
+            <wp:docPr id="313377333" name="Picture 1"/>
+            <wp:cNvGraphicFramePr>
+              <a:graphicFrameLocks xmlns:a="http://schemas.openxmlformats.org/drawingml/2006/main" noChangeAspect="1"/>
+            </wp:cNvGraphicFramePr>
+            <a:graphic xmlns:a="http://schemas.openxmlformats.org/drawingml/2006/main">
+              <a:graphicData uri="http://schemas.openxmlformats.org/drawingml/2006/picture">
+                <pic:pic xmlns:pic="http://schemas.openxmlformats.org/drawingml/2006/picture">
+                  <pic:nvPicPr>
+                    <pic:cNvPr id="313377333" name=""/>
+                    <pic:cNvPicPr/>
+                  </pic:nvPicPr>
+                  <pic:blipFill>
+                    <a:blip r:embed="rId10"/>
+                    <a:stretch>
+                      <a:fillRect/>
+                    </a:stretch>
+                  </pic:blipFill>
+                  <pic:spPr>
+                    <a:xfrm>
+                      <a:off x="0" y="0"/>
+                      <a:ext cx="6175047" cy="3478977"/>
+                    </a:xfrm>
+                    <a:prstGeom prst="rect">
+                      <a:avLst/>
+                    </a:prstGeom>
+                  </pic:spPr>
+                </pic:pic>
+              </a:graphicData>
+            </a:graphic>
+          </wp:inline>
+        </w:drawing>
       </w:r>
     </w:p>
     <w:p>
@@ -1792,6 +2009,211 @@
           <w:szCs w:val="28"/>
         </w:rPr>
       </w:pPr>
+    </w:p>
+    <w:p>
+      <w:pPr>
+        <w:pStyle w:val="BodyTextL25"/>
+        <w:rPr>
+          <w:color w:val="EE0000"/>
+          <w:sz w:val="28"/>
+          <w:szCs w:val="28"/>
+        </w:rPr>
+      </w:pPr>
+    </w:p>
+    <w:p>
+      <w:pPr>
+        <w:pStyle w:val="BodyTextL25"/>
+        <w:rPr>
+          <w:color w:val="EE0000"/>
+          <w:sz w:val="28"/>
+          <w:szCs w:val="28"/>
+        </w:rPr>
+      </w:pPr>
+    </w:p>
+    <w:p>
+      <w:pPr>
+        <w:pStyle w:val="BodyTextL25"/>
+        <w:rPr>
+          <w:color w:val="EE0000"/>
+          <w:sz w:val="28"/>
+          <w:szCs w:val="28"/>
+        </w:rPr>
+      </w:pPr>
+    </w:p>
+    <w:p>
+      <w:pPr>
+        <w:pStyle w:val="BodyTextL25"/>
+        <w:rPr>
+          <w:color w:val="EE0000"/>
+          <w:sz w:val="28"/>
+          <w:szCs w:val="28"/>
+        </w:rPr>
+      </w:pPr>
+    </w:p>
+    <w:p>
+      <w:pPr>
+        <w:pStyle w:val="BodyTextL25"/>
+        <w:rPr>
+          <w:color w:val="EE0000"/>
+          <w:sz w:val="28"/>
+          <w:szCs w:val="28"/>
+        </w:rPr>
+      </w:pPr>
+    </w:p>
+    <w:p>
+      <w:pPr>
+        <w:pStyle w:val="BodyTextL25"/>
+        <w:rPr>
+          <w:color w:val="EE0000"/>
+          <w:sz w:val="28"/>
+          <w:szCs w:val="28"/>
+        </w:rPr>
+      </w:pPr>
+    </w:p>
+    <w:p>
+      <w:pPr>
+        <w:pStyle w:val="BodyTextL25"/>
+        <w:rPr>
+          <w:color w:val="EE0000"/>
+          <w:sz w:val="28"/>
+          <w:szCs w:val="28"/>
+        </w:rPr>
+      </w:pPr>
+    </w:p>
+    <w:p>
+      <w:pPr>
+        <w:pStyle w:val="BodyTextL25"/>
+        <w:rPr>
+          <w:color w:val="EE0000"/>
+          <w:sz w:val="28"/>
+          <w:szCs w:val="28"/>
+        </w:rPr>
+      </w:pPr>
+    </w:p>
+    <w:p>
+      <w:pPr>
+        <w:pStyle w:val="BodyTextL25"/>
+        <w:rPr>
+          <w:color w:val="EE0000"/>
+          <w:sz w:val="28"/>
+          <w:szCs w:val="28"/>
+        </w:rPr>
+      </w:pPr>
+    </w:p>
+    <w:p>
+      <w:pPr>
+        <w:pStyle w:val="BodyTextL25"/>
+        <w:rPr>
+          <w:color w:val="EE0000"/>
+          <w:sz w:val="28"/>
+          <w:szCs w:val="28"/>
+        </w:rPr>
+      </w:pPr>
+      <w:r>
+        <w:rPr>
+          <w:color w:val="EE0000"/>
+          <w:sz w:val="28"/>
+          <w:szCs w:val="28"/>
+        </w:rPr>
+        <w:lastRenderedPageBreak/>
+        <w:t>b.</w:t>
+      </w:r>
+      <w:r>
+        <w:rPr>
+          <w:color w:val="EE0000"/>
+          <w:sz w:val="28"/>
+          <w:szCs w:val="28"/>
+        </w:rPr>
+        <w:t xml:space="preserve"> When entering the ipconfig command into both windows </w:t>
+      </w:r>
+      <w:r>
+        <w:rPr>
+          <w:color w:val="EE0000"/>
+          <w:sz w:val="28"/>
+          <w:szCs w:val="28"/>
+        </w:rPr>
+        <w:t>the output is the same.</w:t>
+      </w:r>
+    </w:p>
+    <w:p>
+      <w:pPr>
+        <w:pStyle w:val="BodyTextL25"/>
+        <w:rPr>
+          <w:color w:val="EE0000"/>
+          <w:sz w:val="28"/>
+          <w:szCs w:val="28"/>
+        </w:rPr>
+      </w:pPr>
+      <w:r>
+        <w:rPr>
+          <w:color w:val="EE0000"/>
+          <w:sz w:val="28"/>
+          <w:szCs w:val="28"/>
+        </w:rPr>
+        <w:drawing>
+          <wp:inline distT="0" distB="0" distL="0" distR="0" wp14:anchorId="518601EA" wp14:editId="41BE16EB">
+            <wp:extent cx="5798729" cy="3284220"/>
+            <wp:effectExtent l="0" t="0" r="0" b="0"/>
+            <wp:docPr id="1627396965" name="Picture 1"/>
+            <wp:cNvGraphicFramePr>
+              <a:graphicFrameLocks xmlns:a="http://schemas.openxmlformats.org/drawingml/2006/main" noChangeAspect="1"/>
+            </wp:cNvGraphicFramePr>
+            <a:graphic xmlns:a="http://schemas.openxmlformats.org/drawingml/2006/main">
+              <a:graphicData uri="http://schemas.openxmlformats.org/drawingml/2006/picture">
+                <pic:pic xmlns:pic="http://schemas.openxmlformats.org/drawingml/2006/picture">
+                  <pic:nvPicPr>
+                    <pic:cNvPr id="1627396965" name=""/>
+                    <pic:cNvPicPr/>
+                  </pic:nvPicPr>
+                  <pic:blipFill>
+                    <a:blip r:embed="rId11"/>
+                    <a:stretch>
+                      <a:fillRect/>
+                    </a:stretch>
+                  </pic:blipFill>
+                  <pic:spPr>
+                    <a:xfrm>
+                      <a:off x="0" y="0"/>
+                      <a:ext cx="5818330" cy="3295321"/>
+                    </a:xfrm>
+                    <a:prstGeom prst="rect">
+                      <a:avLst/>
+                    </a:prstGeom>
+                  </pic:spPr>
+                </pic:pic>
+              </a:graphicData>
+            </a:graphic>
+          </wp:inline>
+        </w:drawing>
+      </w:r>
+      <w:r>
+        <w:rPr>
+          <w:color w:val="EE0000"/>
+          <w:sz w:val="28"/>
+          <w:szCs w:val="28"/>
+        </w:rPr>
+        <w:t xml:space="preserve"> </w:t>
+      </w:r>
+    </w:p>
+    <w:p>
+      <w:pPr>
+        <w:pStyle w:val="BodyTextL25"/>
+        <w:rPr>
+          <w:color w:val="EE0000"/>
+          <w:sz w:val="28"/>
+          <w:szCs w:val="28"/>
+        </w:rPr>
+      </w:pPr>
+    </w:p>
+    <w:p>
+      <w:pPr>
+        <w:pStyle w:val="BodyTextL25"/>
+        <w:rPr>
+          <w:color w:val="EE0000"/>
+          <w:sz w:val="28"/>
+          <w:szCs w:val="28"/>
+        </w:rPr>
+      </w:pPr>
       <w:r>
         <w:rPr>
           <w:color w:val="EE0000"/>
@@ -1816,7 +2238,69 @@
           <w:sz w:val="28"/>
           <w:szCs w:val="28"/>
         </w:rPr>
-        <w:t>a. dir</w:t>
+        <w:t xml:space="preserve">a. </w:t>
+      </w:r>
+      <w:r>
+        <w:rPr>
+          <w:color w:val="EE0000"/>
+          <w:sz w:val="28"/>
+          <w:szCs w:val="28"/>
+        </w:rPr>
+        <w:t xml:space="preserve">After entering Get-Alias </w:t>
+      </w:r>
+      <w:proofErr w:type="spellStart"/>
+      <w:r>
+        <w:rPr>
+          <w:color w:val="EE0000"/>
+          <w:sz w:val="28"/>
+          <w:szCs w:val="28"/>
+        </w:rPr>
+        <w:t>dir</w:t>
+      </w:r>
+      <w:proofErr w:type="spellEnd"/>
+      <w:r>
+        <w:rPr>
+          <w:color w:val="EE0000"/>
+          <w:sz w:val="28"/>
+          <w:szCs w:val="28"/>
+        </w:rPr>
+        <w:t xml:space="preserve"> the command for </w:t>
+      </w:r>
+      <w:proofErr w:type="spellStart"/>
+      <w:r>
+        <w:rPr>
+          <w:color w:val="EE0000"/>
+          <w:sz w:val="28"/>
+          <w:szCs w:val="28"/>
+        </w:rPr>
+        <w:t>dir</w:t>
+      </w:r>
+      <w:proofErr w:type="spellEnd"/>
+      <w:r>
+        <w:rPr>
+          <w:color w:val="EE0000"/>
+          <w:sz w:val="28"/>
+          <w:szCs w:val="28"/>
+        </w:rPr>
+        <w:t xml:space="preserve"> is Get-</w:t>
+      </w:r>
+      <w:proofErr w:type="spellStart"/>
+      <w:r>
+        <w:rPr>
+          <w:color w:val="EE0000"/>
+          <w:sz w:val="28"/>
+          <w:szCs w:val="28"/>
+        </w:rPr>
+        <w:t>ChildItem</w:t>
+      </w:r>
+      <w:proofErr w:type="spellEnd"/>
+      <w:r>
+        <w:rPr>
+          <w:color w:val="EE0000"/>
+          <w:sz w:val="28"/>
+          <w:szCs w:val="28"/>
+        </w:rPr>
+        <w:t>.</w:t>
       </w:r>
     </w:p>
     <w:p>
@@ -1828,6 +2312,48 @@
           <w:szCs w:val="28"/>
         </w:rPr>
       </w:pPr>
+      <w:r>
+        <w:rPr>
+          <w:color w:val="EE0000"/>
+          <w:sz w:val="28"/>
+          <w:szCs w:val="28"/>
+        </w:rPr>
+        <w:drawing>
+          <wp:inline distT="0" distB="0" distL="0" distR="0" wp14:anchorId="748A8CD4" wp14:editId="0D4AD55A">
+            <wp:extent cx="5836920" cy="3330171"/>
+            <wp:effectExtent l="0" t="0" r="0" b="3810"/>
+            <wp:docPr id="482183883" name="Picture 1"/>
+            <wp:cNvGraphicFramePr>
+              <a:graphicFrameLocks xmlns:a="http://schemas.openxmlformats.org/drawingml/2006/main" noChangeAspect="1"/>
+            </wp:cNvGraphicFramePr>
+            <a:graphic xmlns:a="http://schemas.openxmlformats.org/drawingml/2006/main">
+              <a:graphicData uri="http://schemas.openxmlformats.org/drawingml/2006/picture">
+                <pic:pic xmlns:pic="http://schemas.openxmlformats.org/drawingml/2006/picture">
+                  <pic:nvPicPr>
+                    <pic:cNvPr id="482183883" name=""/>
+                    <pic:cNvPicPr/>
+                  </pic:nvPicPr>
+                  <pic:blipFill>
+                    <a:blip r:embed="rId12"/>
+                    <a:stretch>
+                      <a:fillRect/>
+                    </a:stretch>
+                  </pic:blipFill>
+                  <pic:spPr>
+                    <a:xfrm>
+                      <a:off x="0" y="0"/>
+                      <a:ext cx="5843525" cy="3333939"/>
+                    </a:xfrm>
+                    <a:prstGeom prst="rect">
+                      <a:avLst/>
+                    </a:prstGeom>
+                  </pic:spPr>
+                </pic:pic>
+              </a:graphicData>
+            </a:graphic>
+          </wp:inline>
+        </w:drawing>
+      </w:r>
     </w:p>
     <w:p>
       <w:pPr>
@@ -1844,6 +2370,7 @@
           <w:sz w:val="28"/>
           <w:szCs w:val="28"/>
         </w:rPr>
+        <w:lastRenderedPageBreak/>
         <w:t>Part 4:</w:t>
       </w:r>
     </w:p>
@@ -1862,7 +2389,15 @@
           <w:sz w:val="28"/>
           <w:szCs w:val="28"/>
         </w:rPr>
-        <w:t>b. IPv4 Gateway</w:t>
+        <w:t xml:space="preserve">b. </w:t>
+      </w:r>
+      <w:r>
+        <w:rPr>
+          <w:color w:val="EE0000"/>
+          <w:sz w:val="28"/>
+          <w:szCs w:val="28"/>
+        </w:rPr>
+        <w:t>The IPv4 gateway of my windows VM is 10.0.2.2</w:t>
       </w:r>
     </w:p>
     <w:p>
@@ -1880,8 +2415,97 @@
           <w:sz w:val="28"/>
           <w:szCs w:val="28"/>
         </w:rPr>
+        <w:t xml:space="preserve"> </w:t>
+      </w:r>
+      <w:r>
+        <w:rPr>
+          <w:noProof/>
+          <w:color w:val="EE0000"/>
+          <w:sz w:val="28"/>
+          <w:szCs w:val="28"/>
+        </w:rPr>
+        <w:drawing>
+          <wp:inline distT="0" distB="0" distL="0" distR="0" wp14:anchorId="66DFF3A5" wp14:editId="21F0EA7D">
+            <wp:extent cx="5715000" cy="3223049"/>
+            <wp:effectExtent l="0" t="0" r="0" b="0"/>
+            <wp:docPr id="1140451849" name="Picture 2"/>
+            <wp:cNvGraphicFramePr>
+              <a:graphicFrameLocks xmlns:a="http://schemas.openxmlformats.org/drawingml/2006/main" noChangeAspect="1"/>
+            </wp:cNvGraphicFramePr>
+            <a:graphic xmlns:a="http://schemas.openxmlformats.org/drawingml/2006/main">
+              <a:graphicData uri="http://schemas.openxmlformats.org/drawingml/2006/picture">
+                <pic:pic xmlns:pic="http://schemas.openxmlformats.org/drawingml/2006/picture">
+                  <pic:nvPicPr>
+                    <pic:cNvPr id="0" name="Picture 3"/>
+                    <pic:cNvPicPr>
+                      <a:picLocks noChangeAspect="1" noChangeArrowheads="1"/>
+                    </pic:cNvPicPr>
+                  </pic:nvPicPr>
+                  <pic:blipFill>
+                    <a:blip r:embed="rId13" cstate="print">
+                      <a:extLst>
+                        <a:ext uri="{28A0092B-C50C-407E-A947-70E740481C1C}">
+                          <a14:useLocalDpi xmlns:a14="http://schemas.microsoft.com/office/drawing/2010/main" val="0"/>
+                        </a:ext>
+                      </a:extLst>
+                    </a:blip>
+                    <a:srcRect/>
+                    <a:stretch>
+                      <a:fillRect/>
+                    </a:stretch>
+                  </pic:blipFill>
+                  <pic:spPr bwMode="auto">
+                    <a:xfrm>
+                      <a:off x="0" y="0"/>
+                      <a:ext cx="5747547" cy="3241404"/>
+                    </a:xfrm>
+                    <a:prstGeom prst="rect">
+                      <a:avLst/>
+                    </a:prstGeom>
+                    <a:noFill/>
+                  </pic:spPr>
+                </pic:pic>
+              </a:graphicData>
+            </a:graphic>
+          </wp:inline>
+        </w:drawing>
+      </w:r>
+    </w:p>
+    <w:p>
+      <w:pPr>
+        <w:pStyle w:val="BodyTextL25"/>
+        <w:rPr>
+          <w:color w:val="EE0000"/>
+          <w:sz w:val="28"/>
+          <w:szCs w:val="28"/>
+        </w:rPr>
+      </w:pPr>
+    </w:p>
+    <w:p>
+      <w:pPr>
+        <w:pStyle w:val="BodyTextL25"/>
+        <w:rPr>
+          <w:color w:val="EE0000"/>
+          <w:sz w:val="28"/>
+          <w:szCs w:val="28"/>
+        </w:rPr>
+      </w:pPr>
+      <w:r>
+        <w:rPr>
+          <w:color w:val="EE0000"/>
+          <w:sz w:val="28"/>
+          <w:szCs w:val="28"/>
+        </w:rPr>
         <w:t xml:space="preserve">g. </w:t>
       </w:r>
+      <w:r>
+        <w:rPr>
+          <w:color w:val="EE0000"/>
+          <w:sz w:val="28"/>
+          <w:szCs w:val="28"/>
+        </w:rPr>
+        <w:t>PID 960 is related to svchost.exe process. NETWORK SERVICE is the user name for the process. It’s using 6,400k of memory.</w:t>
+      </w:r>
     </w:p>
     <w:p>
       <w:pPr>
@@ -1892,6 +2516,48 @@
           <w:szCs w:val="28"/>
         </w:rPr>
       </w:pPr>
+      <w:r>
+        <w:rPr>
+          <w:color w:val="EE0000"/>
+          <w:sz w:val="28"/>
+          <w:szCs w:val="28"/>
+        </w:rPr>
+        <w:drawing>
+          <wp:inline distT="0" distB="0" distL="0" distR="0" wp14:anchorId="367416DE" wp14:editId="68441892">
+            <wp:extent cx="6400800" cy="3621405"/>
+            <wp:effectExtent l="0" t="0" r="0" b="0"/>
+            <wp:docPr id="623292268" name="Picture 1"/>
+            <wp:cNvGraphicFramePr>
+              <a:graphicFrameLocks xmlns:a="http://schemas.openxmlformats.org/drawingml/2006/main" noChangeAspect="1"/>
+            </wp:cNvGraphicFramePr>
+            <a:graphic xmlns:a="http://schemas.openxmlformats.org/drawingml/2006/main">
+              <a:graphicData uri="http://schemas.openxmlformats.org/drawingml/2006/picture">
+                <pic:pic xmlns:pic="http://schemas.openxmlformats.org/drawingml/2006/picture">
+                  <pic:nvPicPr>
+                    <pic:cNvPr id="623292268" name=""/>
+                    <pic:cNvPicPr/>
+                  </pic:nvPicPr>
+                  <pic:blipFill>
+                    <a:blip r:embed="rId14"/>
+                    <a:stretch>
+                      <a:fillRect/>
+                    </a:stretch>
+                  </pic:blipFill>
+                  <pic:spPr>
+                    <a:xfrm>
+                      <a:off x="0" y="0"/>
+                      <a:ext cx="6400800" cy="3621405"/>
+                    </a:xfrm>
+                    <a:prstGeom prst="rect">
+                      <a:avLst/>
+                    </a:prstGeom>
+                  </pic:spPr>
+                </pic:pic>
+              </a:graphicData>
+            </a:graphic>
+          </wp:inline>
+        </w:drawing>
+      </w:r>
     </w:p>
     <w:p>
       <w:pPr>
@@ -1908,6 +2574,7 @@
           <w:sz w:val="28"/>
           <w:szCs w:val="28"/>
         </w:rPr>
+        <w:lastRenderedPageBreak/>
         <w:t>Part 5:</w:t>
       </w:r>
     </w:p>
@@ -1928,6 +2595,32 @@
         </w:rPr>
         <w:t>c.</w:t>
       </w:r>
+      <w:r>
+        <w:rPr>
+          <w:color w:val="EE0000"/>
+          <w:sz w:val="28"/>
+          <w:szCs w:val="28"/>
+        </w:rPr>
+        <w:t xml:space="preserve"> After entering the clear-</w:t>
+      </w:r>
+      <w:proofErr w:type="spellStart"/>
+      <w:r>
+        <w:rPr>
+          <w:color w:val="EE0000"/>
+          <w:sz w:val="28"/>
+          <w:szCs w:val="28"/>
+        </w:rPr>
+        <w:t>recyclebin</w:t>
+      </w:r>
+      <w:proofErr w:type="spellEnd"/>
+      <w:r>
+        <w:rPr>
+          <w:color w:val="EE0000"/>
+          <w:sz w:val="28"/>
+          <w:szCs w:val="28"/>
+        </w:rPr>
+        <w:t xml:space="preserve"> command the files in the recycle bin were removed.</w:t>
+      </w:r>
     </w:p>
     <w:p>
       <w:pPr>
@@ -1938,6 +2631,48 @@
           <w:szCs w:val="28"/>
         </w:rPr>
       </w:pPr>
+      <w:r>
+        <w:rPr>
+          <w:color w:val="EE0000"/>
+          <w:sz w:val="28"/>
+          <w:szCs w:val="28"/>
+        </w:rPr>
+        <w:drawing>
+          <wp:inline distT="0" distB="0" distL="0" distR="0" wp14:anchorId="7B9FBA24" wp14:editId="541B4713">
+            <wp:extent cx="6400800" cy="3604260"/>
+            <wp:effectExtent l="0" t="0" r="0" b="0"/>
+            <wp:docPr id="1937015344" name="Picture 1"/>
+            <wp:cNvGraphicFramePr>
+              <a:graphicFrameLocks xmlns:a="http://schemas.openxmlformats.org/drawingml/2006/main" noChangeAspect="1"/>
+            </wp:cNvGraphicFramePr>
+            <a:graphic xmlns:a="http://schemas.openxmlformats.org/drawingml/2006/main">
+              <a:graphicData uri="http://schemas.openxmlformats.org/drawingml/2006/picture">
+                <pic:pic xmlns:pic="http://schemas.openxmlformats.org/drawingml/2006/picture">
+                  <pic:nvPicPr>
+                    <pic:cNvPr id="1937015344" name=""/>
+                    <pic:cNvPicPr/>
+                  </pic:nvPicPr>
+                  <pic:blipFill>
+                    <a:blip r:embed="rId15"/>
+                    <a:stretch>
+                      <a:fillRect/>
+                    </a:stretch>
+                  </pic:blipFill>
+                  <pic:spPr>
+                    <a:xfrm>
+                      <a:off x="0" y="0"/>
+                      <a:ext cx="6400800" cy="3604260"/>
+                    </a:xfrm>
+                    <a:prstGeom prst="rect">
+                      <a:avLst/>
+                    </a:prstGeom>
+                  </pic:spPr>
+                </pic:pic>
+              </a:graphicData>
+            </a:graphic>
+          </wp:inline>
+        </w:drawing>
+      </w:r>
     </w:p>
     <w:p>
       <w:pPr>
@@ -1948,6 +2683,16 @@
           <w:szCs w:val="28"/>
         </w:rPr>
       </w:pPr>
+    </w:p>
+    <w:p>
+      <w:pPr>
+        <w:pStyle w:val="BodyTextL25"/>
+        <w:rPr>
+          <w:color w:val="EE0000"/>
+          <w:sz w:val="28"/>
+          <w:szCs w:val="28"/>
+        </w:rPr>
+      </w:pPr>
       <w:r>
         <w:rPr>
           <w:color w:val="EE0000"/>
@@ -1966,21 +2711,339 @@
           <w:szCs w:val="28"/>
         </w:rPr>
       </w:pPr>
+      <w:r>
+        <w:rPr>
+          <w:color w:val="EE0000"/>
+          <w:sz w:val="28"/>
+          <w:szCs w:val="28"/>
+        </w:rPr>
+        <w:t>Some commands that a security analyst could use to simplify attacks:</w:t>
+      </w:r>
     </w:p>
     <w:p>
       <w:pPr>
         <w:pStyle w:val="BodyTextL25"/>
         <w:rPr>
+          <w:color w:val="EE0000"/>
+          <w:sz w:val="28"/>
+          <w:szCs w:val="28"/>
+        </w:rPr>
+      </w:pPr>
+      <w:r>
+        <w:rPr>
+          <w:color w:val="EE0000"/>
+          <w:sz w:val="28"/>
+          <w:szCs w:val="28"/>
+        </w:rPr>
+        <w:t>Get-</w:t>
+      </w:r>
+      <w:proofErr w:type="spellStart"/>
+      <w:r>
+        <w:rPr>
+          <w:color w:val="EE0000"/>
+          <w:sz w:val="28"/>
+          <w:szCs w:val="28"/>
+        </w:rPr>
+        <w:t>LocalUser</w:t>
+      </w:r>
+      <w:proofErr w:type="spellEnd"/>
+      <w:r>
+        <w:rPr>
+          <w:color w:val="EE0000"/>
+          <w:sz w:val="28"/>
+          <w:szCs w:val="28"/>
+        </w:rPr>
+        <w:t xml:space="preserve"> and Get-</w:t>
+      </w:r>
+      <w:proofErr w:type="spellStart"/>
+      <w:r>
+        <w:rPr>
+          <w:color w:val="EE0000"/>
+          <w:sz w:val="28"/>
+          <w:szCs w:val="28"/>
+        </w:rPr>
+        <w:t>LocalGroups</w:t>
+      </w:r>
+      <w:proofErr w:type="spellEnd"/>
+      <w:r>
+        <w:rPr>
+          <w:color w:val="EE0000"/>
+          <w:sz w:val="28"/>
+          <w:szCs w:val="28"/>
+        </w:rPr>
+        <w:t>:</w:t>
+      </w:r>
+      <w:r>
+        <w:rPr>
+          <w:color w:val="EE0000"/>
+          <w:sz w:val="28"/>
+          <w:szCs w:val="28"/>
+        </w:rPr>
+        <w:t xml:space="preserve"> can be used to view a list of active users and info about local groups available these can help to keep track of user accounts.</w:t>
+      </w:r>
+    </w:p>
+    <w:p>
+      <w:pPr>
+        <w:pStyle w:val="BodyTextL25"/>
+        <w:rPr>
+          <w:color w:val="EE0000"/>
+          <w:sz w:val="28"/>
+          <w:szCs w:val="28"/>
+        </w:rPr>
+      </w:pPr>
+    </w:p>
+    <w:p>
+      <w:pPr>
+        <w:pStyle w:val="BodyTextL25"/>
+        <w:rPr>
+          <w:color w:val="EE0000"/>
+          <w:sz w:val="28"/>
+          <w:szCs w:val="28"/>
+        </w:rPr>
+      </w:pPr>
+      <w:r>
+        <w:rPr>
+          <w:color w:val="EE0000"/>
+          <w:sz w:val="28"/>
+          <w:szCs w:val="28"/>
+        </w:rPr>
+        <w:t>Add-</w:t>
+      </w:r>
+      <w:proofErr w:type="spellStart"/>
+      <w:r>
+        <w:rPr>
+          <w:color w:val="EE0000"/>
+          <w:sz w:val="28"/>
+          <w:szCs w:val="28"/>
+        </w:rPr>
+        <w:t>LocalGroupMember</w:t>
+      </w:r>
+      <w:proofErr w:type="spellEnd"/>
+      <w:r>
+        <w:rPr>
+          <w:color w:val="EE0000"/>
+          <w:sz w:val="28"/>
+          <w:szCs w:val="28"/>
+        </w:rPr>
+        <w:t xml:space="preserve"> and Remove-</w:t>
+      </w:r>
+      <w:proofErr w:type="spellStart"/>
+      <w:r>
+        <w:rPr>
+          <w:color w:val="EE0000"/>
+          <w:sz w:val="28"/>
+          <w:szCs w:val="28"/>
+        </w:rPr>
+        <w:t>LocalGroupMember</w:t>
+      </w:r>
+      <w:proofErr w:type="spellEnd"/>
+      <w:r>
+        <w:rPr>
+          <w:color w:val="EE0000"/>
+          <w:sz w:val="28"/>
+          <w:szCs w:val="28"/>
+        </w:rPr>
+        <w:t xml:space="preserve">: can be used to </w:t>
+      </w:r>
+      <w:proofErr w:type="spellStart"/>
+      <w:r>
+        <w:rPr>
+          <w:color w:val="EE0000"/>
+          <w:sz w:val="28"/>
+          <w:szCs w:val="28"/>
+        </w:rPr>
+        <w:t>midfy</w:t>
+      </w:r>
+      <w:proofErr w:type="spellEnd"/>
+      <w:r>
+        <w:rPr>
+          <w:color w:val="EE0000"/>
+          <w:sz w:val="28"/>
+          <w:szCs w:val="28"/>
+        </w:rPr>
+        <w:t xml:space="preserve"> user permissions and groups.</w:t>
+      </w:r>
+      <w:r>
+        <w:rPr>
+          <w:color w:val="EE0000"/>
+          <w:sz w:val="28"/>
+          <w:szCs w:val="28"/>
+        </w:rPr>
+        <w:t xml:space="preserve"> </w:t>
+      </w:r>
+    </w:p>
+    <w:p>
+      <w:pPr>
+        <w:pStyle w:val="BodyTextL25"/>
+        <w:rPr>
+          <w:color w:val="EE0000"/>
+          <w:sz w:val="28"/>
+          <w:szCs w:val="28"/>
+        </w:rPr>
+      </w:pPr>
+    </w:p>
+    <w:p>
+      <w:pPr>
+        <w:pStyle w:val="BodyTextL25"/>
+        <w:rPr>
+          <w:color w:val="EE0000"/>
+          <w:sz w:val="28"/>
+          <w:szCs w:val="28"/>
+        </w:rPr>
+      </w:pPr>
+      <w:r>
+        <w:rPr>
+          <w:color w:val="EE0000"/>
+          <w:sz w:val="28"/>
+          <w:szCs w:val="28"/>
+        </w:rPr>
+        <w:t>Get-</w:t>
+      </w:r>
+      <w:proofErr w:type="spellStart"/>
+      <w:r>
+        <w:rPr>
+          <w:color w:val="EE0000"/>
+          <w:sz w:val="28"/>
+          <w:szCs w:val="28"/>
+        </w:rPr>
+        <w:t>NetAdapter</w:t>
+      </w:r>
+      <w:proofErr w:type="spellEnd"/>
+      <w:r>
+        <w:rPr>
+          <w:color w:val="EE0000"/>
+          <w:sz w:val="28"/>
+          <w:szCs w:val="28"/>
+        </w:rPr>
+        <w:t xml:space="preserve"> and Get-</w:t>
+      </w:r>
+      <w:proofErr w:type="spellStart"/>
+      <w:r>
+        <w:rPr>
+          <w:color w:val="EE0000"/>
+          <w:sz w:val="28"/>
+          <w:szCs w:val="28"/>
+        </w:rPr>
+        <w:t>NetTCPConnection</w:t>
+      </w:r>
+      <w:proofErr w:type="spellEnd"/>
+      <w:r>
+        <w:rPr>
+          <w:color w:val="EE0000"/>
+          <w:sz w:val="28"/>
+          <w:szCs w:val="28"/>
+        </w:rPr>
+        <w:t>: used for identifying network device details and gives you a list of all active TCP connections. Helps to monitor and analyze connections on a network.</w:t>
+      </w:r>
+    </w:p>
+    <w:p>
+      <w:pPr>
+        <w:pStyle w:val="BodyTextL25"/>
+        <w:rPr>
+          <w:color w:val="EE0000"/>
+          <w:sz w:val="28"/>
+          <w:szCs w:val="28"/>
+        </w:rPr>
+      </w:pPr>
+    </w:p>
+    <w:p>
+      <w:pPr>
+        <w:pStyle w:val="BodyTextL25"/>
+        <w:rPr>
+          <w:color w:val="EE0000"/>
+          <w:sz w:val="28"/>
+          <w:szCs w:val="28"/>
+        </w:rPr>
+      </w:pPr>
+    </w:p>
+    <w:p>
+      <w:pPr>
+        <w:pStyle w:val="BodyTextL25"/>
+        <w:rPr>
+          <w:color w:val="EE0000"/>
+          <w:sz w:val="28"/>
+          <w:szCs w:val="28"/>
+        </w:rPr>
+      </w:pPr>
+      <w:r>
+        <w:rPr>
+          <w:color w:val="EE0000"/>
+          <w:sz w:val="28"/>
+          <w:szCs w:val="28"/>
+        </w:rPr>
+        <w:lastRenderedPageBreak/>
+        <w:t>Get-</w:t>
+      </w:r>
+      <w:proofErr w:type="spellStart"/>
+      <w:r>
+        <w:rPr>
+          <w:color w:val="EE0000"/>
+          <w:sz w:val="28"/>
+          <w:szCs w:val="28"/>
+        </w:rPr>
+        <w:t>WinEvent</w:t>
+      </w:r>
+      <w:proofErr w:type="spellEnd"/>
+      <w:r>
+        <w:rPr>
+          <w:color w:val="EE0000"/>
+          <w:sz w:val="28"/>
+          <w:szCs w:val="28"/>
+        </w:rPr>
+        <w:t>: shows detailed information about process creation events. Can be helpful in revealing malicious activity.</w:t>
+      </w:r>
+    </w:p>
+    <w:p>
+      <w:pPr>
+        <w:pStyle w:val="BodyTextL25"/>
+        <w:rPr>
+          <w:color w:val="EE0000"/>
+          <w:sz w:val="28"/>
+          <w:szCs w:val="28"/>
+        </w:rPr>
+      </w:pPr>
+    </w:p>
+    <w:p>
+      <w:pPr>
+        <w:pStyle w:val="BodyTextL25"/>
+        <w:rPr>
+          <w:color w:val="EE0000"/>
+          <w:sz w:val="28"/>
+          <w:szCs w:val="28"/>
+        </w:rPr>
+      </w:pPr>
+      <w:r>
+        <w:rPr>
+          <w:color w:val="EE0000"/>
+          <w:sz w:val="28"/>
+          <w:szCs w:val="28"/>
+        </w:rPr>
+        <w:t xml:space="preserve">Source: </w:t>
+      </w:r>
+      <w:r>
+        <w:rPr>
+          <w:color w:val="EE0000"/>
+          <w:sz w:val="28"/>
+          <w:szCs w:val="28"/>
+        </w:rPr>
+        <w:t>https://powershellcommands.com/powershell-commands-for-security-analyst</w:t>
+      </w:r>
+    </w:p>
+    <w:p>
+      <w:pPr>
+        <w:pStyle w:val="BodyTextL25"/>
+        <w:ind w:left="0"/>
+        <w:rPr>
           <w:sz w:val="28"/>
           <w:szCs w:val="28"/>
         </w:rPr>
       </w:pPr>
     </w:p>
     <w:sectPr>
-      <w:headerReference w:type="default" r:id="rId10"/>
-      <w:footerReference w:type="default" r:id="rId11"/>
-      <w:headerReference w:type="first" r:id="rId12"/>
-      <w:footerReference w:type="first" r:id="rId13"/>
+      <w:headerReference w:type="default" r:id="rId16"/>
+      <w:footerReference w:type="default" r:id="rId17"/>
+      <w:headerReference w:type="first" r:id="rId18"/>
+      <w:footerReference w:type="first" r:id="rId19"/>
       <w:pgSz w:w="12240" w:h="15840" w:code="1"/>
       <w:pgMar w:top="1526" w:right="1080" w:bottom="1296" w:left="1080" w:header="720" w:footer="720" w:gutter="0"/>
       <w:cols w:space="720"/>
@@ -2063,7 +3126,7 @@
       <w:rPr>
         <w:noProof/>
       </w:rPr>
-      <w:t>2020</w:t>
+      <w:t>2026</w:t>
     </w:r>
     <w:r>
       <w:fldChar w:fldCharType="end"/>
@@ -2225,7 +3288,7 @@
       <w:rPr>
         <w:noProof/>
       </w:rPr>
-      <w:t>2020</w:t>
+      <w:t>2026</w:t>
     </w:r>
     <w:r>
       <w:fldChar w:fldCharType="end"/>
@@ -4421,7 +5484,6 @@
   <w:style w:type="character" w:default="1" w:styleId="DefaultParagraphFont">
     <w:name w:val="Default Paragraph Font"/>
     <w:uiPriority w:val="1"/>
-    <w:semiHidden/>
     <w:unhideWhenUsed/>
   </w:style>
   <w:style w:type="table" w:default="1" w:styleId="TableNormal">
@@ -6022,6 +7084,18 @@
     <w:rPr>
       <w:color w:val="800080" w:themeColor="followedHyperlink"/>
       <w:u w:val="single"/>
+    </w:rPr>
+  </w:style>
+  <w:style w:type="character" w:styleId="UnresolvedMention">
+    <w:name w:val="Unresolved Mention"/>
+    <w:basedOn w:val="DefaultParagraphFont"/>
+    <w:uiPriority w:val="99"/>
+    <w:semiHidden/>
+    <w:unhideWhenUsed/>
+    <w:rsid w:val="009E4EAF"/>
+    <w:rPr>
+      <w:color w:val="605E5C"/>
+      <w:shd w:val="clear" w:color="auto" w:fill="E1DFDD"/>
     </w:rPr>
   </w:style>
 </w:styles>
@@ -6181,8 +7255,10 @@
     <w:rsid w:val="006A1E14"/>
     <w:rsid w:val="00A43B80"/>
     <w:rsid w:val="00BD7B96"/>
+    <w:rsid w:val="00C61BAB"/>
     <w:rsid w:val="00CE0545"/>
     <w:rsid w:val="00E37BA5"/>
+    <w:rsid w:val="00F11EA6"/>
     <w:rsid w:val="00F77EF5"/>
     <w:rsid w:val="00FE140D"/>
   </w:rsids>

</xml_diff>